<commit_message>
Flood catalogue data paper (D0) and full reference lists for Papers A, D, 1, 3-7
Co-Authored-By: Claude Opus 5.5 <noreply@anthropic.com>
</commit_message>
<xml_diff>
--- a/paper/kampala_access_paper3.docx
+++ b/paper/kampala_access_paper3.docx
@@ -1772,13 +1772,13 @@
       </w:r>
     </w:p>
     <w:bookmarkEnd w:id="15"/>
-    <w:bookmarkStart w:id="16" w:name="references-to-complete"/>
+    <w:bookmarkStart w:id="16" w:name="references"/>
     <w:p>
       <w:pPr>
         <w:pStyle w:val="Heading1"/>
       </w:pPr>
       <w:r>
-        <w:t xml:space="preserve">References (to complete)</w:t>
+        <w:t xml:space="preserve">References</w:t>
       </w:r>
     </w:p>
     <w:p>
@@ -1790,7 +1790,23 @@
         </w:numPr>
       </w:pPr>
       <w:r>
-        <w:t xml:space="preserve">Papers A, D and 1 of this programme.</w:t>
+        <w:t xml:space="preserve">Green, D., Yu, D., Pattison, I., Wilby, R., Bosher, L., Patel, R., Thompson, P., Trowell, K., Draycon, J., Halse, M., Yang, L. and Ryley, T. (2017). City-scale accessibility of emergency responders operating during flood events.</w:t>
+      </w:r>
+      <w:r>
+        <w:t xml:space="preserve"> </w:t>
+      </w:r>
+      <w:r>
+        <w:rPr>
+          <w:i/>
+          <w:iCs/>
+        </w:rPr>
+        <w:t xml:space="preserve">Natural Hazards and Earth System Sciences</w:t>
+      </w:r>
+      <w:r>
+        <w:t xml:space="preserve"> </w:t>
+      </w:r>
+      <w:r>
+        <w:t xml:space="preserve">17, 1–16. doi:10.5194/nhess-17-1-2017</w:t>
       </w:r>
     </w:p>
     <w:p>
@@ -1802,7 +1818,32 @@
         </w:numPr>
       </w:pPr>
       <w:r>
-        <w:t xml:space="preserve">OpenStreetMap contributors; JRC GHS-POP R2023A; Copernicus GLO-30.</w:t>
+        <w:t xml:space="preserve">Coles, D., Yu, D., Wilby, R. L., Green, D. and Herring, Z. (2017). Beyond</w:t>
+      </w:r>
+      <w:r>
+        <w:t xml:space="preserve"> </w:t>
+      </w:r>
+      <w:r>
+        <w:t xml:space="preserve">‘flood hotspots’</w:t>
+      </w:r>
+      <w:r>
+        <w:t xml:space="preserve">: modelling emergency service accessibility during flooding in York, UK.</w:t>
+      </w:r>
+      <w:r>
+        <w:t xml:space="preserve"> </w:t>
+      </w:r>
+      <w:r>
+        <w:rPr>
+          <w:i/>
+          <w:iCs/>
+        </w:rPr>
+        <w:t xml:space="preserve">Journal of Hydrology</w:t>
+      </w:r>
+      <w:r>
+        <w:t xml:space="preserve"> </w:t>
+      </w:r>
+      <w:r>
+        <w:t xml:space="preserve">546, 419–436. doi:10.1016/j.jhydrol.2016.12.013</w:t>
       </w:r>
     </w:p>
     <w:p>
@@ -1814,7 +1855,208 @@
         </w:numPr>
       </w:pPr>
       <w:r>
-        <w:t xml:space="preserve">Literature on flood impacts on emergency access (for example, Green et al., urban flood access and ambulance response) to be added.</w:t>
+        <w:t xml:space="preserve">Yin, J., Yu, D., Yin, Z., Liu, M. and He, Q. (2016). Evaluating the impact and risk of pluvial flash flood on intra-urban road network: a case study in the city center of Shanghai, China.</w:t>
+      </w:r>
+      <w:r>
+        <w:t xml:space="preserve"> </w:t>
+      </w:r>
+      <w:r>
+        <w:rPr>
+          <w:i/>
+          <w:iCs/>
+        </w:rPr>
+        <w:t xml:space="preserve">Journal of Hydrology</w:t>
+      </w:r>
+      <w:r>
+        <w:t xml:space="preserve"> </w:t>
+      </w:r>
+      <w:r>
+        <w:t xml:space="preserve">537, 138–145. doi:10.1016/j.jhydrol.2016.03.037</w:t>
+      </w:r>
+    </w:p>
+    <w:p>
+      <w:pPr>
+        <w:pStyle w:val="Compact"/>
+        <w:numPr>
+          <w:ilvl w:val="0"/>
+          <w:numId w:val="1007"/>
+        </w:numPr>
+      </w:pPr>
+      <w:r>
+        <w:t xml:space="preserve">Pregnolato, M., Ford, A., Wilkinson, S. M. and Dawson, R. J. (2017). The impact of flooding on road transport: a depth-disruption function.</w:t>
+      </w:r>
+      <w:r>
+        <w:t xml:space="preserve"> </w:t>
+      </w:r>
+      <w:r>
+        <w:rPr>
+          <w:i/>
+          <w:iCs/>
+        </w:rPr>
+        <w:t xml:space="preserve">Transportation Research Part D</w:t>
+      </w:r>
+      <w:r>
+        <w:t xml:space="preserve"> </w:t>
+      </w:r>
+      <w:r>
+        <w:t xml:space="preserve">55, 67–81. doi:10.1016/j.trd.2017.06.020</w:t>
+      </w:r>
+    </w:p>
+    <w:p>
+      <w:pPr>
+        <w:pStyle w:val="Compact"/>
+        <w:numPr>
+          <w:ilvl w:val="0"/>
+          <w:numId w:val="1007"/>
+        </w:numPr>
+      </w:pPr>
+      <w:r>
+        <w:t xml:space="preserve">Weiss, D. J. et al. (2020). Global maps of travel time to healthcare facilities.</w:t>
+      </w:r>
+      <w:r>
+        <w:t xml:space="preserve"> </w:t>
+      </w:r>
+      <w:r>
+        <w:rPr>
+          <w:i/>
+          <w:iCs/>
+        </w:rPr>
+        <w:t xml:space="preserve">Nature Medicine</w:t>
+      </w:r>
+      <w:r>
+        <w:t xml:space="preserve"> </w:t>
+      </w:r>
+      <w:r>
+        <w:t xml:space="preserve">26, 1835–1838. doi:10.1038/s41591-020-1059-1</w:t>
+      </w:r>
+    </w:p>
+    <w:p>
+      <w:pPr>
+        <w:pStyle w:val="Compact"/>
+        <w:numPr>
+          <w:ilvl w:val="0"/>
+          <w:numId w:val="1007"/>
+        </w:numPr>
+      </w:pPr>
+      <w:r>
+        <w:t xml:space="preserve">Dijkstra, E. W. (1959). A note on two problems in connexion with graphs.</w:t>
+      </w:r>
+      <w:r>
+        <w:t xml:space="preserve"> </w:t>
+      </w:r>
+      <w:r>
+        <w:rPr>
+          <w:i/>
+          <w:iCs/>
+        </w:rPr>
+        <w:t xml:space="preserve">Numerische Mathematik</w:t>
+      </w:r>
+      <w:r>
+        <w:t xml:space="preserve"> </w:t>
+      </w:r>
+      <w:r>
+        <w:t xml:space="preserve">1, 269–271.</w:t>
+      </w:r>
+    </w:p>
+    <w:p>
+      <w:pPr>
+        <w:pStyle w:val="Compact"/>
+        <w:numPr>
+          <w:ilvl w:val="0"/>
+          <w:numId w:val="1007"/>
+        </w:numPr>
+      </w:pPr>
+      <w:r>
+        <w:t xml:space="preserve">Hagberg, A. A., Schult, D. A. and Swart, P. J. (2008). Exploring network structure, dynamics, and function using NetworkX.</w:t>
+      </w:r>
+      <w:r>
+        <w:t xml:space="preserve"> </w:t>
+      </w:r>
+      <w:r>
+        <w:rPr>
+          <w:i/>
+          <w:iCs/>
+        </w:rPr>
+        <w:t xml:space="preserve">Proceedings of the 7th Python in Science Conference</w:t>
+      </w:r>
+      <w:r>
+        <w:t xml:space="preserve">, 11–15.</w:t>
+      </w:r>
+    </w:p>
+    <w:p>
+      <w:pPr>
+        <w:pStyle w:val="Compact"/>
+        <w:numPr>
+          <w:ilvl w:val="0"/>
+          <w:numId w:val="1007"/>
+        </w:numPr>
+      </w:pPr>
+      <w:r>
+        <w:t xml:space="preserve">OpenStreetMap contributors. OpenStreetMap. openstreetmap.org (data under ODbL).</w:t>
+      </w:r>
+    </w:p>
+    <w:p>
+      <w:pPr>
+        <w:pStyle w:val="Compact"/>
+        <w:numPr>
+          <w:ilvl w:val="0"/>
+          <w:numId w:val="1007"/>
+        </w:numPr>
+      </w:pPr>
+      <w:r>
+        <w:t xml:space="preserve">Schiavina, M., Freire, S., Carioli, A. and MacManus, K. (2023). GHS-POP R2023A: GHS population grid, 1975–2030. European Commission, Joint Research Centre.</w:t>
+      </w:r>
+    </w:p>
+    <w:p>
+      <w:pPr>
+        <w:pStyle w:val="Compact"/>
+        <w:numPr>
+          <w:ilvl w:val="0"/>
+          <w:numId w:val="1007"/>
+        </w:numPr>
+      </w:pPr>
+      <w:r>
+        <w:t xml:space="preserve">European Space Agency (2021). Copernicus DEM GLO-30. doi:10.5270/ESA-c5d3d65</w:t>
+      </w:r>
+    </w:p>
+    <w:p>
+      <w:pPr>
+        <w:pStyle w:val="Compact"/>
+        <w:numPr>
+          <w:ilvl w:val="0"/>
+          <w:numId w:val="1007"/>
+        </w:numPr>
+      </w:pPr>
+      <w:r>
+        <w:t xml:space="preserve">Nobre, A. D., Cuartas, L. A., Hodnett, M., Rennó, C. D., Rodrigues, G., Silveira, A., Waterloo, M. and Saleska, S. (2011). Height Above the Nearest Drainage – a hydrologically relevant new terrain model.</w:t>
+      </w:r>
+      <w:r>
+        <w:t xml:space="preserve"> </w:t>
+      </w:r>
+      <w:r>
+        <w:rPr>
+          <w:i/>
+          <w:iCs/>
+        </w:rPr>
+        <w:t xml:space="preserve">Journal of Hydrology</w:t>
+      </w:r>
+      <w:r>
+        <w:t xml:space="preserve"> </w:t>
+      </w:r>
+      <w:r>
+        <w:t xml:space="preserve">404, 13–29. doi:10.1016/j.jhydrol.2011.03.051</w:t>
+      </w:r>
+    </w:p>
+    <w:p>
+      <w:pPr>
+        <w:pStyle w:val="Compact"/>
+        <w:numPr>
+          <w:ilvl w:val="0"/>
+          <w:numId w:val="1007"/>
+        </w:numPr>
+      </w:pPr>
+      <w:r>
+        <w:t xml:space="preserve">Companion papers of this programme: A, D and 1.</w:t>
       </w:r>
     </w:p>
     <w:bookmarkEnd w:id="16"/>
@@ -2029,6 +2271,91 @@
       <w:rPr>
         <w:rFonts w:ascii="Wingdings" w:hAnsi="Wingdings" w:cs="Wingdings" w:hint="default"/>
       </w:rPr>
+    </w:lvl>
+  </w:abstractNum>
+  <w:abstractNum w:abstractNumId="99411">
+    <w:nsid w:val="00A99411"/>
+    <w:multiLevelType w:val="multilevel"/>
+    <w:lvl w:ilvl="0">
+      <w:start w:val="1"/>
+      <w:numFmt w:val="decimal"/>
+      <w:lvlText w:val="%1."/>
+      <w:lvlJc w:val="left"/>
+      <w:pPr>
+        <w:ind w:left="720" w:hanging="360"/>
+      </w:pPr>
+    </w:lvl>
+    <w:lvl w:ilvl="1">
+      <w:start w:val="1"/>
+      <w:numFmt w:val="decimal"/>
+      <w:lvlText w:val="%2."/>
+      <w:lvlJc w:val="left"/>
+      <w:pPr>
+        <w:ind w:left="1440" w:hanging="360"/>
+      </w:pPr>
+    </w:lvl>
+    <w:lvl w:ilvl="2">
+      <w:start w:val="1"/>
+      <w:numFmt w:val="decimal"/>
+      <w:lvlText w:val="%3."/>
+      <w:lvlJc w:val="left"/>
+      <w:pPr>
+        <w:ind w:left="2160" w:hanging="360"/>
+      </w:pPr>
+    </w:lvl>
+    <w:lvl w:ilvl="3">
+      <w:start w:val="1"/>
+      <w:numFmt w:val="decimal"/>
+      <w:lvlText w:val="%4."/>
+      <w:lvlJc w:val="left"/>
+      <w:pPr>
+        <w:ind w:left="2880" w:hanging="360"/>
+      </w:pPr>
+    </w:lvl>
+    <w:lvl w:ilvl="4">
+      <w:start w:val="1"/>
+      <w:numFmt w:val="decimal"/>
+      <w:lvlText w:val="%5."/>
+      <w:lvlJc w:val="left"/>
+      <w:pPr>
+        <w:ind w:left="3600" w:hanging="360"/>
+      </w:pPr>
+    </w:lvl>
+    <w:lvl w:ilvl="5">
+      <w:start w:val="1"/>
+      <w:numFmt w:val="decimal"/>
+      <w:lvlText w:val="%6."/>
+      <w:lvlJc w:val="left"/>
+      <w:pPr>
+        <w:ind w:left="4320" w:hanging="360"/>
+      </w:pPr>
+    </w:lvl>
+    <w:lvl w:ilvl="6">
+      <w:start w:val="1"/>
+      <w:numFmt w:val="decimal"/>
+      <w:lvlText w:val="%7."/>
+      <w:lvlJc w:val="left"/>
+      <w:pPr>
+        <w:ind w:left="5040" w:hanging="360"/>
+      </w:pPr>
+    </w:lvl>
+    <w:lvl w:ilvl="7">
+      <w:start w:val="1"/>
+      <w:numFmt w:val="decimal"/>
+      <w:lvlText w:val="%8."/>
+      <w:lvlJc w:val="left"/>
+      <w:pPr>
+        <w:ind w:left="5760" w:hanging="360"/>
+      </w:pPr>
+    </w:lvl>
+    <w:lvl w:ilvl="8">
+      <w:start w:val="1"/>
+      <w:numFmt w:val="decimal"/>
+      <w:lvlText w:val="%9."/>
+      <w:lvlJc w:val="left"/>
+      <w:pPr>
+        <w:ind w:left="6480" w:hanging="360"/>
+      </w:pPr>
     </w:lvl>
   </w:abstractNum>
   <w:num w:numId="1000">
@@ -2053,7 +2380,34 @@
     <w:abstractNumId w:val="991"/>
   </w:num>
   <w:num w:numId="1007">
-    <w:abstractNumId w:val="991"/>
+    <w:abstractNumId w:val="99411"/>
+    <w:lvlOverride w:ilvl="0">
+      <w:startOverride w:val="1"/>
+    </w:lvlOverride>
+    <w:lvlOverride w:ilvl="1">
+      <w:startOverride w:val="1"/>
+    </w:lvlOverride>
+    <w:lvlOverride w:ilvl="2">
+      <w:startOverride w:val="1"/>
+    </w:lvlOverride>
+    <w:lvlOverride w:ilvl="3">
+      <w:startOverride w:val="1"/>
+    </w:lvlOverride>
+    <w:lvlOverride w:ilvl="4">
+      <w:startOverride w:val="1"/>
+    </w:lvlOverride>
+    <w:lvlOverride w:ilvl="5">
+      <w:startOverride w:val="1"/>
+    </w:lvlOverride>
+    <w:lvlOverride w:ilvl="6">
+      <w:startOverride w:val="1"/>
+    </w:lvlOverride>
+    <w:lvlOverride w:ilvl="7">
+      <w:startOverride w:val="1"/>
+    </w:lvlOverride>
+    <w:lvlOverride w:ilvl="8">
+      <w:startOverride w:val="1"/>
+    </w:lvlOverride>
   </w:num>
 </w:numbering>
 </file>

</xml_diff>